<commit_message>
feat: GraphRAG + long-term memory fully working in Docker - 24K node graph, Weaviate-backed memory, score-key fixes
</commit_message>
<xml_diff>
--- a/data/test_docs/test_report.docx
+++ b/data/test_docs/test_report.docx
@@ -407,6 +407,203 @@
         <w:t>Appendix: Technical Details</w:t>
       </w:r>
     </w:p>
+    <w:p>
+      <w:pPr>
+        <w:pStyle w:val="Heading2"/>
+      </w:pPr>
+      <w:r>
+        <w:t>Performance Metrics</w:t>
+      </w:r>
+    </w:p>
+    <w:tbl>
+      <w:tblPr>
+        <w:tblStyle w:val="TableGrid"/>
+        <w:tblW w:type="auto" w:w="0"/>
+        <w:tblLook w:firstColumn="1" w:firstRow="1" w:lastColumn="0" w:lastRow="0" w:noHBand="0" w:noVBand="1" w:val="04A0"/>
+      </w:tblPr>
+      <w:tblGrid>
+        <w:gridCol w:w="2880"/>
+        <w:gridCol w:w="2880"/>
+        <w:gridCol w:w="2880"/>
+      </w:tblGrid>
+      <w:tr>
+        <w:tc>
+          <w:tcPr>
+            <w:tcW w:type="dxa" w:w="2880"/>
+          </w:tcPr>
+          <w:p>
+            <w:r>
+              <w:rPr>
+                <w:b/>
+              </w:rPr>
+              <w:t>Method</w:t>
+            </w:r>
+          </w:p>
+        </w:tc>
+        <w:tc>
+          <w:tcPr>
+            <w:tcW w:type="dxa" w:w="2880"/>
+          </w:tcPr>
+          <w:p>
+            <w:r>
+              <w:rPr>
+                <w:b/>
+              </w:rPr>
+              <w:t>NDCG@10</w:t>
+            </w:r>
+          </w:p>
+        </w:tc>
+        <w:tc>
+          <w:tcPr>
+            <w:tcW w:type="dxa" w:w="2880"/>
+          </w:tcPr>
+          <w:p>
+            <w:r>
+              <w:rPr>
+                <w:b/>
+              </w:rPr>
+              <w:t>Latency (s)</w:t>
+            </w:r>
+          </w:p>
+        </w:tc>
+      </w:tr>
+      <w:tr>
+        <w:tc>
+          <w:tcPr>
+            <w:tcW w:type="dxa" w:w="2880"/>
+          </w:tcPr>
+          <w:p>
+            <w:r>
+              <w:t>Baseline BM25</w:t>
+            </w:r>
+          </w:p>
+        </w:tc>
+        <w:tc>
+          <w:tcPr>
+            <w:tcW w:type="dxa" w:w="2880"/>
+          </w:tcPr>
+          <w:p>
+            <w:r>
+              <w:t>0.54</w:t>
+            </w:r>
+          </w:p>
+        </w:tc>
+        <w:tc>
+          <w:tcPr>
+            <w:tcW w:type="dxa" w:w="2880"/>
+          </w:tcPr>
+          <w:p>
+            <w:r>
+              <w:t>1.2</w:t>
+            </w:r>
+          </w:p>
+        </w:tc>
+      </w:tr>
+      <w:tr>
+        <w:tc>
+          <w:tcPr>
+            <w:tcW w:type="dxa" w:w="2880"/>
+          </w:tcPr>
+          <w:p>
+            <w:r>
+              <w:t>Vector Search</w:t>
+            </w:r>
+          </w:p>
+        </w:tc>
+        <w:tc>
+          <w:tcPr>
+            <w:tcW w:type="dxa" w:w="2880"/>
+          </w:tcPr>
+          <w:p>
+            <w:r>
+              <w:t>0.61</w:t>
+            </w:r>
+          </w:p>
+        </w:tc>
+        <w:tc>
+          <w:tcPr>
+            <w:tcW w:type="dxa" w:w="2880"/>
+          </w:tcPr>
+          <w:p>
+            <w:r>
+              <w:t>1.4</w:t>
+            </w:r>
+          </w:p>
+        </w:tc>
+      </w:tr>
+      <w:tr>
+        <w:tc>
+          <w:tcPr>
+            <w:tcW w:type="dxa" w:w="2880"/>
+          </w:tcPr>
+          <w:p>
+            <w:r>
+              <w:t>Hybrid RRF</w:t>
+            </w:r>
+          </w:p>
+        </w:tc>
+        <w:tc>
+          <w:tcPr>
+            <w:tcW w:type="dxa" w:w="2880"/>
+          </w:tcPr>
+          <w:p>
+            <w:r>
+              <w:t>0.73</w:t>
+            </w:r>
+          </w:p>
+        </w:tc>
+        <w:tc>
+          <w:tcPr>
+            <w:tcW w:type="dxa" w:w="2880"/>
+          </w:tcPr>
+          <w:p>
+            <w:r>
+              <w:t>1.5</w:t>
+            </w:r>
+          </w:p>
+        </w:tc>
+      </w:tr>
+      <w:tr>
+        <w:tc>
+          <w:tcPr>
+            <w:tcW w:type="dxa" w:w="2880"/>
+          </w:tcPr>
+          <w:p>
+            <w:r>
+              <w:t>Fine-tuned RAG</w:t>
+            </w:r>
+          </w:p>
+        </w:tc>
+        <w:tc>
+          <w:tcPr>
+            <w:tcW w:type="dxa" w:w="2880"/>
+          </w:tcPr>
+          <w:p>
+            <w:r>
+              <w:t>0.81</w:t>
+            </w:r>
+          </w:p>
+        </w:tc>
+        <w:tc>
+          <w:tcPr>
+            <w:tcW w:type="dxa" w:w="2880"/>
+          </w:tcPr>
+          <w:p>
+            <w:r>
+              <w:t>2.1</w:t>
+            </w:r>
+          </w:p>
+        </w:tc>
+      </w:tr>
+    </w:tbl>
+    <w:p>
+      <w:pPr>
+        <w:pStyle w:val="Heading2"/>
+      </w:pPr>
+      <w:r>
+        <w:t>Agent Pipeline Status</w:t>
+      </w:r>
+    </w:p>
     <w:sectPr>
       <w:pgSz w:w="12240" w:h="15840"/>
       <w:pgMar w:top="1440" w:right="1800" w:bottom="1440" w:left="1800" w:header="720" w:footer="720" w:gutter="0"/>

</xml_diff>